<commit_message>
Add individual week worksheets (W1, W10, W11, W12) and update Weeks2-9; bump config to v2.5.1
</commit_message>
<xml_diff>
--- a/SCIE1500Materials/SCIE1500_Group_Worksheet_Weeks_2_to_9.docx
+++ b/SCIE1500Materials/SCIE1500_Group_Worksheet_Weeks_2_to_9.docx
@@ -877,6 +877,11 @@
       </w:r>
       <w:r>
         <w:t xml:space="preserve"> = Group Mark × (Peer Contribution Score ÷ 100). See Section 2.4 of the Lab Handbook.</w:t>
+      </w:r>
+    </w:p>
+    <w:p>
+      <w:r>
+        <w:t>ℹ️  Using the Problem Brief: The guide below shows which questions from your Problem Brief map to each section. Questions 1–2 typically inform Section 1 (Formulation) and Section 2 (Setup); Questions 3–5 inform Section 3 (Solution); Questions 6–7 inform Sections 4–5 (Results and Interpretation).</w:t>
       </w:r>
     </w:p>
     <w:p>

</xml_diff>